<commit_message>
Adicionado Regras de Negocio, Requisitos Funcionais e Requisitor nao funcionais
</commit_message>
<xml_diff>
--- a/A4 Lab. Desenv. Web - FAC.docx
+++ b/A4 Lab. Desenv. Web - FAC.docx
@@ -309,14 +309,12 @@
           <w:sz w:val="28"/>
         </w:rPr>
       </w:pPr>
-      <w:proofErr w:type="spellStart"/>
       <w:r>
         <w:rPr>
           <w:sz w:val="28"/>
         </w:rPr>
         <w:t>Fac</w:t>
       </w:r>
-      <w:proofErr w:type="spellEnd"/>
     </w:p>
     <w:p>
       <w:pPr>
@@ -639,14 +637,12 @@
           <w:sz w:val="28"/>
         </w:rPr>
       </w:pPr>
-      <w:proofErr w:type="spellStart"/>
       <w:r>
         <w:rPr>
           <w:sz w:val="28"/>
         </w:rPr>
         <w:t>Fac</w:t>
       </w:r>
-      <w:proofErr w:type="spellEnd"/>
     </w:p>
     <w:p>
       <w:pPr>
@@ -772,13 +768,8 @@
       <w:pPr>
         <w:pStyle w:val="NomedoOrientador"/>
       </w:pPr>
-      <w:proofErr w:type="spellStart"/>
-      <w:r>
-        <w:t>Co-orientador</w:t>
-      </w:r>
-      <w:proofErr w:type="spellEnd"/>
-      <w:r>
-        <w:t xml:space="preserve">: </w:t>
+      <w:r>
+        <w:t xml:space="preserve">Co-orientador: </w:t>
       </w:r>
       <w:r>
         <w:rPr>
@@ -796,16 +787,8 @@
         <w:rPr>
           <w:color w:val="FF0000"/>
         </w:rPr>
-        <w:t xml:space="preserve"> do </w:t>
-      </w:r>
-      <w:proofErr w:type="spellStart"/>
-      <w:r>
-        <w:rPr>
-          <w:color w:val="FF0000"/>
-        </w:rPr>
-        <w:t>co-orientador</w:t>
-      </w:r>
-      <w:proofErr w:type="spellEnd"/>
+        <w:t xml:space="preserve"> do co-orientador</w:t>
+      </w:r>
       <w:r>
         <w:rPr>
           <w:color w:val="FF0000"/>
@@ -1164,21 +1147,12 @@
           <w:color w:val="0000FF"/>
         </w:rPr>
       </w:pPr>
-      <w:proofErr w:type="spellStart"/>
       <w:r>
         <w:rPr>
           <w:rFonts w:cs="Arial"/>
           <w:color w:val="0000FF"/>
         </w:rPr>
-        <w:t>Obs</w:t>
-      </w:r>
-      <w:proofErr w:type="spellEnd"/>
-      <w:r>
-        <w:rPr>
-          <w:rFonts w:cs="Arial"/>
-          <w:color w:val="0000FF"/>
-        </w:rPr>
-        <w:t>: Gráficos e imagens são tratados como “figura”</w:t>
+        <w:t>Obs: Gráficos e imagens são tratados como “figura”</w:t>
       </w:r>
       <w:r>
         <w:rPr>
@@ -2247,21 +2221,7 @@
         </w:numPr>
       </w:pPr>
       <w:r>
-        <w:t>Controle de Jornada: Desenvolver um sistema de controle de plantão com registro de entrada (check-in) e saída (</w:t>
-      </w:r>
-      <w:proofErr w:type="spellStart"/>
-      <w:r>
-        <w:t>check-out</w:t>
-      </w:r>
-      <w:proofErr w:type="spellEnd"/>
-      <w:r>
-        <w:t>)</w:t>
-      </w:r>
-      <w:r>
-        <w:t xml:space="preserve">, ligado ao gps, </w:t>
-      </w:r>
-      <w:r>
-        <w:t>exclusivo para o perfil das cuidadoras.</w:t>
+        <w:t>Controle de Jornada: Desenvolver um sistema de controle de plantão com registro de entrada (check-in) e saída (check-out), ligado ao gps, exclusivo para o perfil das cuidadoras.</w:t>
       </w:r>
     </w:p>
     <w:p>
@@ -2347,6 +2307,1921 @@
           <w:rFonts w:cs="Arial"/>
         </w:rPr>
       </w:pPr>
+    </w:p>
+    <w:p>
+      <w:pPr>
+        <w:ind w:firstLine="0"/>
+        <w:rPr>
+          <w:rFonts w:cs="Arial"/>
+        </w:rPr>
+      </w:pPr>
+    </w:p>
+    <w:p>
+      <w:pPr>
+        <w:pStyle w:val="Ttulo2"/>
+      </w:pPr>
+      <w:r>
+        <w:lastRenderedPageBreak/>
+        <w:t>3.2 Regras de Negócio</w:t>
+      </w:r>
+    </w:p>
+    <w:tbl>
+      <w:tblPr>
+        <w:tblStyle w:val="Tabelacomgrade"/>
+        <w:tblW w:w="0" w:type="auto"/>
+        <w:tblLook w:val="04A0" w:firstRow="1" w:lastRow="0" w:firstColumn="1" w:lastColumn="0" w:noHBand="0" w:noVBand="1"/>
+      </w:tblPr>
+      <w:tblGrid>
+        <w:gridCol w:w="846"/>
+        <w:gridCol w:w="8215"/>
+      </w:tblGrid>
+      <w:tr>
+        <w:tc>
+          <w:tcPr>
+            <w:tcW w:w="846" w:type="dxa"/>
+          </w:tcPr>
+          <w:p>
+            <w:pPr>
+              <w:ind w:firstLine="0"/>
+              <w:jc w:val="center"/>
+              <w:rPr>
+                <w:rFonts w:cs="Arial"/>
+                <w:b/>
+                <w:bCs/>
+              </w:rPr>
+            </w:pPr>
+            <w:r>
+              <w:rPr>
+                <w:rFonts w:cs="Arial"/>
+                <w:b/>
+                <w:bCs/>
+              </w:rPr>
+              <w:t>Nº</w:t>
+            </w:r>
+          </w:p>
+        </w:tc>
+        <w:tc>
+          <w:tcPr>
+            <w:tcW w:w="8215" w:type="dxa"/>
+          </w:tcPr>
+          <w:p>
+            <w:pPr>
+              <w:ind w:firstLine="0"/>
+              <w:jc w:val="center"/>
+              <w:rPr>
+                <w:rFonts w:cs="Arial"/>
+                <w:b/>
+                <w:bCs/>
+              </w:rPr>
+            </w:pPr>
+            <w:r>
+              <w:rPr>
+                <w:rFonts w:cs="Arial"/>
+                <w:b/>
+                <w:bCs/>
+              </w:rPr>
+              <w:t>Descrição</w:t>
+            </w:r>
+          </w:p>
+        </w:tc>
+      </w:tr>
+      <w:tr>
+        <w:tc>
+          <w:tcPr>
+            <w:tcW w:w="846" w:type="dxa"/>
+          </w:tcPr>
+          <w:p>
+            <w:pPr>
+              <w:ind w:firstLine="0"/>
+              <w:jc w:val="center"/>
+              <w:rPr>
+                <w:rFonts w:cs="Arial"/>
+              </w:rPr>
+            </w:pPr>
+            <w:r>
+              <w:rPr>
+                <w:rFonts w:cs="Arial"/>
+              </w:rPr>
+              <w:t>RN01</w:t>
+            </w:r>
+          </w:p>
+        </w:tc>
+        <w:tc>
+          <w:tcPr>
+            <w:tcW w:w="8215" w:type="dxa"/>
+          </w:tcPr>
+          <w:p>
+            <w:pPr>
+              <w:ind w:firstLine="0"/>
+              <w:rPr>
+                <w:rFonts w:cs="Arial"/>
+              </w:rPr>
+            </w:pPr>
+            <w:r>
+              <w:rPr>
+                <w:rFonts w:cs="Arial"/>
+              </w:rPr>
+              <w:t>O check-in só pode ser realizado se o GPS validar que a cuidadora está na residência do paciente.</w:t>
+            </w:r>
+          </w:p>
+        </w:tc>
+      </w:tr>
+      <w:tr>
+        <w:tc>
+          <w:tcPr>
+            <w:tcW w:w="846" w:type="dxa"/>
+          </w:tcPr>
+          <w:p>
+            <w:pPr>
+              <w:ind w:firstLine="0"/>
+              <w:jc w:val="center"/>
+              <w:rPr>
+                <w:rFonts w:cs="Arial"/>
+              </w:rPr>
+            </w:pPr>
+            <w:r>
+              <w:rPr>
+                <w:rFonts w:cs="Arial"/>
+              </w:rPr>
+              <w:t>RN02</w:t>
+            </w:r>
+          </w:p>
+        </w:tc>
+        <w:tc>
+          <w:tcPr>
+            <w:tcW w:w="8215" w:type="dxa"/>
+          </w:tcPr>
+          <w:p>
+            <w:pPr>
+              <w:ind w:firstLine="0"/>
+              <w:rPr>
+                <w:rFonts w:cs="Arial"/>
+              </w:rPr>
+            </w:pPr>
+            <w:r>
+              <w:rPr>
+                <w:rFonts w:cs="Arial"/>
+              </w:rPr>
+              <w:t xml:space="preserve">As anotações do diário de </w:t>
+            </w:r>
+            <w:r>
+              <w:rPr>
+                <w:rFonts w:cs="Arial"/>
+              </w:rPr>
+              <w:t>plantão</w:t>
+            </w:r>
+            <w:r>
+              <w:rPr>
+                <w:rFonts w:cs="Arial"/>
+              </w:rPr>
+              <w:t xml:space="preserve"> só podem ser editadas enquanto </w:t>
+            </w:r>
+            <w:r>
+              <w:rPr>
+                <w:rFonts w:cs="Arial"/>
+              </w:rPr>
+              <w:t xml:space="preserve">ele </w:t>
+            </w:r>
+            <w:r>
+              <w:rPr>
+                <w:rFonts w:cs="Arial"/>
+              </w:rPr>
+              <w:t>estiver "Aberto".</w:t>
+            </w:r>
+          </w:p>
+        </w:tc>
+      </w:tr>
+      <w:tr>
+        <w:tc>
+          <w:tcPr>
+            <w:tcW w:w="846" w:type="dxa"/>
+          </w:tcPr>
+          <w:p>
+            <w:pPr>
+              <w:ind w:firstLine="0"/>
+              <w:jc w:val="center"/>
+              <w:rPr>
+                <w:rFonts w:cs="Arial"/>
+              </w:rPr>
+            </w:pPr>
+            <w:r>
+              <w:rPr>
+                <w:rFonts w:cs="Arial"/>
+              </w:rPr>
+              <w:t>RN03</w:t>
+            </w:r>
+          </w:p>
+        </w:tc>
+        <w:tc>
+          <w:tcPr>
+            <w:tcW w:w="8215" w:type="dxa"/>
+          </w:tcPr>
+          <w:p>
+            <w:pPr>
+              <w:ind w:firstLine="0"/>
+              <w:rPr>
+                <w:rFonts w:cs="Arial"/>
+              </w:rPr>
+            </w:pPr>
+            <w:r>
+              <w:rPr>
+                <w:rFonts w:cs="Arial"/>
+              </w:rPr>
+              <w:t>O familiar gestor tem permissão total de leitura para todos os relatórios e históricos.</w:t>
+            </w:r>
+          </w:p>
+        </w:tc>
+      </w:tr>
+      <w:tr>
+        <w:tc>
+          <w:tcPr>
+            <w:tcW w:w="846" w:type="dxa"/>
+          </w:tcPr>
+          <w:p>
+            <w:pPr>
+              <w:ind w:firstLine="0"/>
+              <w:jc w:val="center"/>
+              <w:rPr>
+                <w:rFonts w:cs="Arial"/>
+              </w:rPr>
+            </w:pPr>
+            <w:r>
+              <w:rPr>
+                <w:rFonts w:cs="Arial"/>
+              </w:rPr>
+              <w:t>RN04</w:t>
+            </w:r>
+          </w:p>
+        </w:tc>
+        <w:tc>
+          <w:tcPr>
+            <w:tcW w:w="8215" w:type="dxa"/>
+          </w:tcPr>
+          <w:p>
+            <w:pPr>
+              <w:ind w:firstLine="0"/>
+              <w:rPr>
+                <w:rFonts w:cs="Arial"/>
+              </w:rPr>
+            </w:pPr>
+            <w:r>
+              <w:rPr>
+                <w:rFonts w:cs="Arial"/>
+              </w:rPr>
+              <w:t>Quem marca na agenda os as consultas de médicos ou exames são os familiares.</w:t>
+            </w:r>
+          </w:p>
+        </w:tc>
+      </w:tr>
+      <w:tr>
+        <w:tc>
+          <w:tcPr>
+            <w:tcW w:w="846" w:type="dxa"/>
+          </w:tcPr>
+          <w:p>
+            <w:pPr>
+              <w:ind w:firstLine="0"/>
+              <w:jc w:val="center"/>
+              <w:rPr>
+                <w:rFonts w:cs="Arial"/>
+              </w:rPr>
+            </w:pPr>
+            <w:r>
+              <w:rPr>
+                <w:rFonts w:cs="Arial"/>
+              </w:rPr>
+              <w:t>RN05</w:t>
+            </w:r>
+          </w:p>
+        </w:tc>
+        <w:tc>
+          <w:tcPr>
+            <w:tcW w:w="8215" w:type="dxa"/>
+          </w:tcPr>
+          <w:p>
+            <w:pPr>
+              <w:ind w:firstLine="0"/>
+              <w:rPr>
+                <w:rFonts w:cs="Arial"/>
+              </w:rPr>
+            </w:pPr>
+            <w:r>
+              <w:rPr>
+                <w:rFonts w:cs="Arial"/>
+              </w:rPr>
+              <w:t>Não é permitido que possua 2 plantões abertos ao mesmo tempo.</w:t>
+            </w:r>
+          </w:p>
+        </w:tc>
+      </w:tr>
+      <w:tr>
+        <w:tc>
+          <w:tcPr>
+            <w:tcW w:w="846" w:type="dxa"/>
+          </w:tcPr>
+          <w:p>
+            <w:pPr>
+              <w:ind w:firstLine="0"/>
+              <w:jc w:val="center"/>
+              <w:rPr>
+                <w:rFonts w:cs="Arial"/>
+              </w:rPr>
+            </w:pPr>
+            <w:r>
+              <w:rPr>
+                <w:rFonts w:cs="Arial"/>
+              </w:rPr>
+              <w:t>RN06</w:t>
+            </w:r>
+          </w:p>
+        </w:tc>
+        <w:tc>
+          <w:tcPr>
+            <w:tcW w:w="8215" w:type="dxa"/>
+          </w:tcPr>
+          <w:p>
+            <w:pPr>
+              <w:ind w:firstLine="0"/>
+              <w:rPr>
+                <w:rFonts w:cs="Arial"/>
+              </w:rPr>
+            </w:pPr>
+          </w:p>
+        </w:tc>
+      </w:tr>
+    </w:tbl>
+    <w:p>
+      <w:pPr>
+        <w:ind w:firstLine="0"/>
+        <w:rPr>
+          <w:rFonts w:cs="Arial"/>
+        </w:rPr>
+      </w:pPr>
+    </w:p>
+    <w:p>
+      <w:pPr>
+        <w:pStyle w:val="Ttulo2"/>
+      </w:pPr>
+      <w:r>
+        <w:t>3.3 Requisitos Funcionais</w:t>
+      </w:r>
+    </w:p>
+    <w:p>
+      <w:pPr>
+        <w:ind w:firstLine="0"/>
+        <w:rPr>
+          <w:rFonts w:cs="Arial"/>
+        </w:rPr>
+      </w:pPr>
+    </w:p>
+    <w:tbl>
+      <w:tblPr>
+        <w:tblStyle w:val="Tabelacomgrade"/>
+        <w:tblW w:w="0" w:type="auto"/>
+        <w:tblLook w:val="04A0" w:firstRow="1" w:lastRow="0" w:firstColumn="1" w:lastColumn="0" w:noHBand="0" w:noVBand="1"/>
+      </w:tblPr>
+      <w:tblGrid>
+        <w:gridCol w:w="834"/>
+        <w:gridCol w:w="1724"/>
+        <w:gridCol w:w="5155"/>
+        <w:gridCol w:w="1348"/>
+      </w:tblGrid>
+      <w:tr>
+        <w:tc>
+          <w:tcPr>
+            <w:tcW w:w="839" w:type="dxa"/>
+          </w:tcPr>
+          <w:p>
+            <w:pPr>
+              <w:ind w:firstLine="0"/>
+              <w:jc w:val="center"/>
+              <w:rPr>
+                <w:rFonts w:cs="Arial"/>
+                <w:b/>
+                <w:bCs/>
+              </w:rPr>
+            </w:pPr>
+            <w:r>
+              <w:rPr>
+                <w:rFonts w:cs="Arial"/>
+                <w:b/>
+                <w:bCs/>
+              </w:rPr>
+              <w:t>Nº</w:t>
+            </w:r>
+          </w:p>
+        </w:tc>
+        <w:tc>
+          <w:tcPr>
+            <w:tcW w:w="1141" w:type="dxa"/>
+          </w:tcPr>
+          <w:p>
+            <w:pPr>
+              <w:ind w:firstLine="0"/>
+              <w:jc w:val="center"/>
+              <w:rPr>
+                <w:rFonts w:cs="Arial"/>
+                <w:b/>
+                <w:bCs/>
+              </w:rPr>
+            </w:pPr>
+            <w:r>
+              <w:rPr>
+                <w:rFonts w:cs="Arial"/>
+                <w:b/>
+                <w:bCs/>
+              </w:rPr>
+              <w:t>RF</w:t>
+            </w:r>
+          </w:p>
+        </w:tc>
+        <w:tc>
+          <w:tcPr>
+            <w:tcW w:w="5704" w:type="dxa"/>
+          </w:tcPr>
+          <w:p>
+            <w:pPr>
+              <w:ind w:firstLine="0"/>
+              <w:jc w:val="center"/>
+              <w:rPr>
+                <w:rFonts w:cs="Arial"/>
+                <w:b/>
+                <w:bCs/>
+              </w:rPr>
+            </w:pPr>
+            <w:r>
+              <w:rPr>
+                <w:rFonts w:cs="Arial"/>
+                <w:b/>
+                <w:bCs/>
+              </w:rPr>
+              <w:t>Descrição</w:t>
+            </w:r>
+          </w:p>
+        </w:tc>
+        <w:tc>
+          <w:tcPr>
+            <w:tcW w:w="1377" w:type="dxa"/>
+          </w:tcPr>
+          <w:p>
+            <w:pPr>
+              <w:ind w:firstLine="0"/>
+              <w:jc w:val="center"/>
+              <w:rPr>
+                <w:rFonts w:cs="Arial"/>
+                <w:b/>
+                <w:bCs/>
+              </w:rPr>
+            </w:pPr>
+            <w:r>
+              <w:rPr>
+                <w:rFonts w:cs="Arial"/>
+                <w:b/>
+                <w:bCs/>
+              </w:rPr>
+              <w:t>Ator</w:t>
+            </w:r>
+          </w:p>
+        </w:tc>
+      </w:tr>
+      <w:tr>
+        <w:tc>
+          <w:tcPr>
+            <w:tcW w:w="839" w:type="dxa"/>
+          </w:tcPr>
+          <w:p>
+            <w:pPr>
+              <w:ind w:firstLine="0"/>
+              <w:jc w:val="center"/>
+              <w:rPr>
+                <w:rFonts w:cs="Arial"/>
+              </w:rPr>
+            </w:pPr>
+            <w:r>
+              <w:rPr>
+                <w:rFonts w:cs="Arial"/>
+              </w:rPr>
+              <w:t>RF01</w:t>
+            </w:r>
+          </w:p>
+        </w:tc>
+        <w:tc>
+          <w:tcPr>
+            <w:tcW w:w="1141" w:type="dxa"/>
+          </w:tcPr>
+          <w:p>
+            <w:pPr>
+              <w:ind w:firstLine="0"/>
+              <w:jc w:val="center"/>
+              <w:rPr>
+                <w:rFonts w:cs="Arial"/>
+              </w:rPr>
+            </w:pPr>
+            <w:r>
+              <w:rPr>
+                <w:rFonts w:cs="Arial"/>
+              </w:rPr>
+              <w:t>Manter Médico</w:t>
+            </w:r>
+          </w:p>
+        </w:tc>
+        <w:tc>
+          <w:tcPr>
+            <w:tcW w:w="5704" w:type="dxa"/>
+          </w:tcPr>
+          <w:p>
+            <w:pPr>
+              <w:ind w:firstLine="0"/>
+              <w:rPr>
+                <w:rFonts w:cs="Arial"/>
+              </w:rPr>
+            </w:pPr>
+            <w:r>
+              <w:rPr>
+                <w:rFonts w:cs="Arial"/>
+              </w:rPr>
+              <w:t>O sistema deve permitir o cadastro</w:t>
+            </w:r>
+            <w:r>
+              <w:rPr>
+                <w:rFonts w:cs="Arial"/>
+              </w:rPr>
+              <w:t xml:space="preserve"> </w:t>
+            </w:r>
+            <w:r>
+              <w:rPr>
+                <w:rFonts w:cs="Arial"/>
+              </w:rPr>
+              <w:t xml:space="preserve">(inclusão, alteração, exclusão e </w:t>
+            </w:r>
+          </w:p>
+          <w:p>
+            <w:pPr>
+              <w:ind w:firstLine="0"/>
+              <w:rPr>
+                <w:rFonts w:cs="Arial"/>
+              </w:rPr>
+            </w:pPr>
+            <w:r>
+              <w:rPr>
+                <w:rFonts w:cs="Arial"/>
+              </w:rPr>
+              <w:t>consulta)</w:t>
+            </w:r>
+            <w:r>
+              <w:rPr>
+                <w:rFonts w:cs="Arial"/>
+              </w:rPr>
+              <w:t xml:space="preserve"> </w:t>
+            </w:r>
+            <w:r>
+              <w:rPr>
+                <w:rFonts w:cs="Arial"/>
+              </w:rPr>
+              <w:t>de médicos, incluindo nome, especialidade e contatos.</w:t>
+            </w:r>
+          </w:p>
+        </w:tc>
+        <w:tc>
+          <w:tcPr>
+            <w:tcW w:w="1377" w:type="dxa"/>
+          </w:tcPr>
+          <w:p>
+            <w:pPr>
+              <w:ind w:firstLine="0"/>
+              <w:jc w:val="center"/>
+              <w:rPr>
+                <w:rFonts w:cs="Arial"/>
+              </w:rPr>
+            </w:pPr>
+            <w:r>
+              <w:rPr>
+                <w:rFonts w:cs="Arial"/>
+              </w:rPr>
+              <w:t>Familiar</w:t>
+            </w:r>
+          </w:p>
+        </w:tc>
+      </w:tr>
+      <w:tr>
+        <w:tc>
+          <w:tcPr>
+            <w:tcW w:w="839" w:type="dxa"/>
+          </w:tcPr>
+          <w:p>
+            <w:pPr>
+              <w:ind w:firstLine="0"/>
+              <w:jc w:val="center"/>
+              <w:rPr>
+                <w:rFonts w:cs="Arial"/>
+              </w:rPr>
+            </w:pPr>
+            <w:r>
+              <w:rPr>
+                <w:rFonts w:cs="Arial"/>
+              </w:rPr>
+              <w:t>RF0</w:t>
+            </w:r>
+            <w:r>
+              <w:rPr>
+                <w:rFonts w:cs="Arial"/>
+              </w:rPr>
+              <w:t>2</w:t>
+            </w:r>
+          </w:p>
+        </w:tc>
+        <w:tc>
+          <w:tcPr>
+            <w:tcW w:w="1141" w:type="dxa"/>
+          </w:tcPr>
+          <w:p>
+            <w:pPr>
+              <w:ind w:firstLine="0"/>
+              <w:jc w:val="center"/>
+              <w:rPr>
+                <w:rFonts w:cs="Arial"/>
+              </w:rPr>
+            </w:pPr>
+            <w:r>
+              <w:rPr>
+                <w:rFonts w:cs="Arial"/>
+              </w:rPr>
+              <w:t>Manter</w:t>
+            </w:r>
+            <w:r>
+              <w:rPr>
+                <w:rFonts w:cs="Arial"/>
+              </w:rPr>
+              <w:t xml:space="preserve"> Familiar</w:t>
+            </w:r>
+          </w:p>
+        </w:tc>
+        <w:tc>
+          <w:tcPr>
+            <w:tcW w:w="5704" w:type="dxa"/>
+          </w:tcPr>
+          <w:p>
+            <w:pPr>
+              <w:ind w:firstLine="0"/>
+              <w:rPr>
+                <w:rFonts w:cs="Arial"/>
+              </w:rPr>
+            </w:pPr>
+            <w:r>
+              <w:rPr>
+                <w:rFonts w:cs="Arial"/>
+              </w:rPr>
+              <w:t>O sistema deve permitir a gestão</w:t>
+            </w:r>
+            <w:r>
+              <w:rPr>
+                <w:rFonts w:cs="Arial"/>
+              </w:rPr>
+              <w:t xml:space="preserve"> e cadastro </w:t>
+            </w:r>
+            <w:r>
+              <w:rPr>
+                <w:rFonts w:cs="Arial"/>
+              </w:rPr>
+              <w:t xml:space="preserve">(inclusão, alteração, exclusão e </w:t>
+            </w:r>
+          </w:p>
+          <w:p>
+            <w:pPr>
+              <w:ind w:firstLine="0"/>
+              <w:rPr>
+                <w:rFonts w:cs="Arial"/>
+              </w:rPr>
+            </w:pPr>
+            <w:r>
+              <w:rPr>
+                <w:rFonts w:cs="Arial"/>
+              </w:rPr>
+              <w:t>consulta) dos perfis dos familiares responsáveis pelo gerenciamento do cuidado.</w:t>
+            </w:r>
+          </w:p>
+        </w:tc>
+        <w:tc>
+          <w:tcPr>
+            <w:tcW w:w="1377" w:type="dxa"/>
+          </w:tcPr>
+          <w:p>
+            <w:pPr>
+              <w:ind w:firstLine="0"/>
+              <w:jc w:val="center"/>
+              <w:rPr>
+                <w:rFonts w:cs="Arial"/>
+              </w:rPr>
+            </w:pPr>
+            <w:r>
+              <w:rPr>
+                <w:rFonts w:cs="Arial"/>
+              </w:rPr>
+              <w:t>Familiar</w:t>
+            </w:r>
+          </w:p>
+        </w:tc>
+      </w:tr>
+      <w:tr>
+        <w:tc>
+          <w:tcPr>
+            <w:tcW w:w="839" w:type="dxa"/>
+          </w:tcPr>
+          <w:p>
+            <w:pPr>
+              <w:ind w:firstLine="0"/>
+              <w:jc w:val="center"/>
+              <w:rPr>
+                <w:rFonts w:cs="Arial"/>
+              </w:rPr>
+            </w:pPr>
+            <w:r>
+              <w:rPr>
+                <w:rFonts w:cs="Arial"/>
+              </w:rPr>
+              <w:t>RF0</w:t>
+            </w:r>
+            <w:r>
+              <w:rPr>
+                <w:rFonts w:cs="Arial"/>
+              </w:rPr>
+              <w:t>3</w:t>
+            </w:r>
+          </w:p>
+        </w:tc>
+        <w:tc>
+          <w:tcPr>
+            <w:tcW w:w="1141" w:type="dxa"/>
+          </w:tcPr>
+          <w:p>
+            <w:pPr>
+              <w:ind w:firstLine="0"/>
+              <w:jc w:val="center"/>
+              <w:rPr>
+                <w:rFonts w:cs="Arial"/>
+              </w:rPr>
+            </w:pPr>
+            <w:r>
+              <w:rPr>
+                <w:rFonts w:cs="Arial"/>
+              </w:rPr>
+              <w:t>Manter Paciente</w:t>
+            </w:r>
+          </w:p>
+        </w:tc>
+        <w:tc>
+          <w:tcPr>
+            <w:tcW w:w="5704" w:type="dxa"/>
+          </w:tcPr>
+          <w:p>
+            <w:pPr>
+              <w:ind w:firstLine="0"/>
+              <w:rPr>
+                <w:rFonts w:cs="Arial"/>
+              </w:rPr>
+            </w:pPr>
+            <w:r>
+              <w:rPr>
+                <w:rFonts w:cs="Arial"/>
+              </w:rPr>
+              <w:t xml:space="preserve">O sistema deve permitir o cadastro (inclusão, alteração, exclusão e </w:t>
+            </w:r>
+          </w:p>
+          <w:p>
+            <w:pPr>
+              <w:ind w:firstLine="0"/>
+              <w:rPr>
+                <w:rFonts w:cs="Arial"/>
+              </w:rPr>
+            </w:pPr>
+            <w:r>
+              <w:rPr>
+                <w:rFonts w:cs="Arial"/>
+              </w:rPr>
+              <w:t xml:space="preserve">consulta) do paciente </w:t>
+            </w:r>
+            <w:r>
+              <w:rPr>
+                <w:rFonts w:cs="Arial"/>
+              </w:rPr>
+              <w:t>que receberá os cuidados</w:t>
+            </w:r>
+            <w:r>
+              <w:rPr>
+                <w:rFonts w:cs="Arial"/>
+              </w:rPr>
+              <w:t>.</w:t>
+            </w:r>
+          </w:p>
+        </w:tc>
+        <w:tc>
+          <w:tcPr>
+            <w:tcW w:w="1377" w:type="dxa"/>
+          </w:tcPr>
+          <w:p>
+            <w:pPr>
+              <w:ind w:firstLine="0"/>
+              <w:jc w:val="center"/>
+              <w:rPr>
+                <w:rFonts w:cs="Arial"/>
+              </w:rPr>
+            </w:pPr>
+            <w:r>
+              <w:rPr>
+                <w:rFonts w:cs="Arial"/>
+              </w:rPr>
+              <w:t>Familiar</w:t>
+            </w:r>
+          </w:p>
+        </w:tc>
+      </w:tr>
+      <w:tr>
+        <w:tc>
+          <w:tcPr>
+            <w:tcW w:w="839" w:type="dxa"/>
+          </w:tcPr>
+          <w:p>
+            <w:pPr>
+              <w:ind w:firstLine="0"/>
+              <w:jc w:val="center"/>
+              <w:rPr>
+                <w:rFonts w:cs="Arial"/>
+              </w:rPr>
+            </w:pPr>
+            <w:r>
+              <w:rPr>
+                <w:rFonts w:cs="Arial"/>
+              </w:rPr>
+              <w:t>RF0</w:t>
+            </w:r>
+            <w:r>
+              <w:rPr>
+                <w:rFonts w:cs="Arial"/>
+              </w:rPr>
+              <w:t>4</w:t>
+            </w:r>
+          </w:p>
+        </w:tc>
+        <w:tc>
+          <w:tcPr>
+            <w:tcW w:w="1141" w:type="dxa"/>
+          </w:tcPr>
+          <w:p>
+            <w:pPr>
+              <w:ind w:firstLine="0"/>
+              <w:jc w:val="center"/>
+              <w:rPr>
+                <w:rFonts w:cs="Arial"/>
+              </w:rPr>
+            </w:pPr>
+            <w:r>
+              <w:rPr>
+                <w:rFonts w:cs="Arial"/>
+              </w:rPr>
+              <w:t>Manter Cuidador</w:t>
+            </w:r>
+          </w:p>
+        </w:tc>
+        <w:tc>
+          <w:tcPr>
+            <w:tcW w:w="5704" w:type="dxa"/>
+          </w:tcPr>
+          <w:p>
+            <w:pPr>
+              <w:ind w:firstLine="0"/>
+              <w:rPr>
+                <w:rFonts w:cs="Arial"/>
+              </w:rPr>
+            </w:pPr>
+            <w:r>
+              <w:rPr>
+                <w:rFonts w:cs="Arial"/>
+              </w:rPr>
+              <w:t>O sistema deve permitir o cadastro</w:t>
+            </w:r>
+            <w:r>
+              <w:rPr>
+                <w:rFonts w:cs="Arial"/>
+              </w:rPr>
+              <w:t xml:space="preserve"> </w:t>
+            </w:r>
+            <w:r>
+              <w:rPr>
+                <w:rFonts w:cs="Arial"/>
+              </w:rPr>
+              <w:t xml:space="preserve">(inclusão, alteração, exclusão e </w:t>
+            </w:r>
+          </w:p>
+          <w:p>
+            <w:pPr>
+              <w:ind w:firstLine="0"/>
+              <w:rPr>
+                <w:rFonts w:cs="Arial"/>
+              </w:rPr>
+            </w:pPr>
+            <w:r>
+              <w:rPr>
+                <w:rFonts w:cs="Arial"/>
+              </w:rPr>
+              <w:t>consulta) das cuidadoras.</w:t>
+            </w:r>
+          </w:p>
+        </w:tc>
+        <w:tc>
+          <w:tcPr>
+            <w:tcW w:w="1377" w:type="dxa"/>
+          </w:tcPr>
+          <w:p>
+            <w:pPr>
+              <w:ind w:firstLine="0"/>
+              <w:jc w:val="center"/>
+              <w:rPr>
+                <w:rFonts w:cs="Arial"/>
+              </w:rPr>
+            </w:pPr>
+            <w:r>
+              <w:rPr>
+                <w:rFonts w:cs="Arial"/>
+              </w:rPr>
+              <w:t>Familiar</w:t>
+            </w:r>
+          </w:p>
+        </w:tc>
+      </w:tr>
+      <w:tr>
+        <w:tc>
+          <w:tcPr>
+            <w:tcW w:w="839" w:type="dxa"/>
+          </w:tcPr>
+          <w:p>
+            <w:pPr>
+              <w:ind w:firstLine="0"/>
+              <w:jc w:val="center"/>
+              <w:rPr>
+                <w:rFonts w:cs="Arial"/>
+              </w:rPr>
+            </w:pPr>
+            <w:r>
+              <w:rPr>
+                <w:rFonts w:cs="Arial"/>
+              </w:rPr>
+              <w:lastRenderedPageBreak/>
+              <w:t>RF0</w:t>
+            </w:r>
+            <w:r>
+              <w:rPr>
+                <w:rFonts w:cs="Arial"/>
+              </w:rPr>
+              <w:t>5</w:t>
+            </w:r>
+          </w:p>
+        </w:tc>
+        <w:tc>
+          <w:tcPr>
+            <w:tcW w:w="1141" w:type="dxa"/>
+          </w:tcPr>
+          <w:p>
+            <w:pPr>
+              <w:ind w:firstLine="0"/>
+              <w:jc w:val="center"/>
+              <w:rPr>
+                <w:rFonts w:cs="Arial"/>
+              </w:rPr>
+            </w:pPr>
+            <w:r>
+              <w:rPr>
+                <w:rFonts w:cs="Arial"/>
+              </w:rPr>
+              <w:t>Manter</w:t>
+            </w:r>
+            <w:r>
+              <w:rPr>
+                <w:rFonts w:cs="Arial"/>
+              </w:rPr>
+              <w:t xml:space="preserve"> Consulta</w:t>
+            </w:r>
+          </w:p>
+        </w:tc>
+        <w:tc>
+          <w:tcPr>
+            <w:tcW w:w="5704" w:type="dxa"/>
+          </w:tcPr>
+          <w:p>
+            <w:pPr>
+              <w:ind w:firstLine="0"/>
+              <w:rPr>
+                <w:rFonts w:cs="Arial"/>
+              </w:rPr>
+            </w:pPr>
+            <w:r>
+              <w:rPr>
+                <w:rFonts w:cs="Arial"/>
+              </w:rPr>
+              <w:t>O sistema deve permitir o agendamento e visualização de consultas e exames médicos na agenda.</w:t>
+            </w:r>
+          </w:p>
+        </w:tc>
+        <w:tc>
+          <w:tcPr>
+            <w:tcW w:w="1377" w:type="dxa"/>
+          </w:tcPr>
+          <w:p>
+            <w:pPr>
+              <w:ind w:firstLine="0"/>
+              <w:jc w:val="center"/>
+              <w:rPr>
+                <w:rFonts w:cs="Arial"/>
+              </w:rPr>
+            </w:pPr>
+            <w:r>
+              <w:rPr>
+                <w:rFonts w:cs="Arial"/>
+              </w:rPr>
+              <w:t>Familiar</w:t>
+            </w:r>
+          </w:p>
+        </w:tc>
+      </w:tr>
+      <w:tr>
+        <w:tc>
+          <w:tcPr>
+            <w:tcW w:w="839" w:type="dxa"/>
+          </w:tcPr>
+          <w:p>
+            <w:pPr>
+              <w:ind w:firstLine="0"/>
+              <w:jc w:val="center"/>
+              <w:rPr>
+                <w:rFonts w:cs="Arial"/>
+              </w:rPr>
+            </w:pPr>
+            <w:r>
+              <w:rPr>
+                <w:rFonts w:cs="Arial"/>
+              </w:rPr>
+              <w:t>RF06</w:t>
+            </w:r>
+          </w:p>
+        </w:tc>
+        <w:tc>
+          <w:tcPr>
+            <w:tcW w:w="1141" w:type="dxa"/>
+          </w:tcPr>
+          <w:p>
+            <w:pPr>
+              <w:ind w:firstLine="0"/>
+              <w:jc w:val="center"/>
+              <w:rPr>
+                <w:rFonts w:cs="Arial"/>
+              </w:rPr>
+            </w:pPr>
+            <w:r>
+              <w:rPr>
+                <w:rFonts w:cs="Arial"/>
+              </w:rPr>
+              <w:t>Registrar Ponto</w:t>
+            </w:r>
+          </w:p>
+        </w:tc>
+        <w:tc>
+          <w:tcPr>
+            <w:tcW w:w="5704" w:type="dxa"/>
+          </w:tcPr>
+          <w:p>
+            <w:pPr>
+              <w:ind w:firstLine="0"/>
+              <w:rPr>
+                <w:rFonts w:cs="Arial"/>
+              </w:rPr>
+            </w:pPr>
+            <w:r>
+              <w:rPr>
+                <w:rFonts w:cs="Arial"/>
+              </w:rPr>
+              <w:t>O sistema deve registrar os horários de entrada (check-in) e saída (check-out) integrados à localização via GPS</w:t>
+            </w:r>
+            <w:r>
+              <w:rPr>
+                <w:rFonts w:cs="Arial"/>
+              </w:rPr>
+              <w:t xml:space="preserve"> impedindo</w:t>
+            </w:r>
+            <w:r>
+              <w:rPr>
+                <w:rFonts w:cs="Arial"/>
+              </w:rPr>
+              <w:t xml:space="preserve"> o check-in caso o cuidador esteja fora de um raio determinado da residência do paciente.</w:t>
+            </w:r>
+          </w:p>
+        </w:tc>
+        <w:tc>
+          <w:tcPr>
+            <w:tcW w:w="1377" w:type="dxa"/>
+          </w:tcPr>
+          <w:p>
+            <w:pPr>
+              <w:ind w:firstLine="0"/>
+              <w:jc w:val="center"/>
+              <w:rPr>
+                <w:rFonts w:cs="Arial"/>
+              </w:rPr>
+            </w:pPr>
+            <w:r>
+              <w:rPr>
+                <w:rFonts w:cs="Arial"/>
+              </w:rPr>
+              <w:t>Cuidador</w:t>
+            </w:r>
+          </w:p>
+        </w:tc>
+      </w:tr>
+      <w:tr>
+        <w:tc>
+          <w:tcPr>
+            <w:tcW w:w="839" w:type="dxa"/>
+          </w:tcPr>
+          <w:p>
+            <w:pPr>
+              <w:ind w:firstLine="0"/>
+              <w:jc w:val="center"/>
+              <w:rPr>
+                <w:rFonts w:cs="Arial"/>
+              </w:rPr>
+            </w:pPr>
+            <w:r>
+              <w:rPr>
+                <w:rFonts w:cs="Arial"/>
+              </w:rPr>
+              <w:t>RF0</w:t>
+            </w:r>
+            <w:r>
+              <w:rPr>
+                <w:rFonts w:cs="Arial"/>
+              </w:rPr>
+              <w:t>7</w:t>
+            </w:r>
+          </w:p>
+        </w:tc>
+        <w:tc>
+          <w:tcPr>
+            <w:tcW w:w="1141" w:type="dxa"/>
+          </w:tcPr>
+          <w:p>
+            <w:pPr>
+              <w:ind w:firstLine="0"/>
+              <w:jc w:val="center"/>
+              <w:rPr>
+                <w:rFonts w:cs="Arial"/>
+              </w:rPr>
+            </w:pPr>
+            <w:r>
+              <w:rPr>
+                <w:rFonts w:cs="Arial"/>
+              </w:rPr>
+              <w:t>Manter diário de Plantão.</w:t>
+            </w:r>
+          </w:p>
+        </w:tc>
+        <w:tc>
+          <w:tcPr>
+            <w:tcW w:w="5704" w:type="dxa"/>
+          </w:tcPr>
+          <w:p>
+            <w:pPr>
+              <w:ind w:firstLine="0"/>
+              <w:rPr>
+                <w:rFonts w:cs="Arial"/>
+              </w:rPr>
+            </w:pPr>
+            <w:r>
+              <w:rPr>
+                <w:rFonts w:cs="Arial"/>
+              </w:rPr>
+              <w:t>O sistema deve permitir o registro de ocorrências, medicações e estado geral do paciente durante o plantão aberto.</w:t>
+            </w:r>
+          </w:p>
+        </w:tc>
+        <w:tc>
+          <w:tcPr>
+            <w:tcW w:w="1377" w:type="dxa"/>
+          </w:tcPr>
+          <w:p>
+            <w:pPr>
+              <w:ind w:firstLine="0"/>
+              <w:jc w:val="center"/>
+              <w:rPr>
+                <w:rFonts w:cs="Arial"/>
+              </w:rPr>
+            </w:pPr>
+            <w:r>
+              <w:rPr>
+                <w:rFonts w:cs="Arial"/>
+              </w:rPr>
+              <w:t>Cuidador</w:t>
+            </w:r>
+          </w:p>
+        </w:tc>
+      </w:tr>
+      <w:tr>
+        <w:tc>
+          <w:tcPr>
+            <w:tcW w:w="839" w:type="dxa"/>
+          </w:tcPr>
+          <w:p>
+            <w:pPr>
+              <w:ind w:firstLine="0"/>
+              <w:jc w:val="center"/>
+              <w:rPr>
+                <w:rFonts w:cs="Arial"/>
+              </w:rPr>
+            </w:pPr>
+            <w:r>
+              <w:rPr>
+                <w:rFonts w:cs="Arial"/>
+              </w:rPr>
+              <w:t>RF08</w:t>
+            </w:r>
+          </w:p>
+        </w:tc>
+        <w:tc>
+          <w:tcPr>
+            <w:tcW w:w="1141" w:type="dxa"/>
+          </w:tcPr>
+          <w:p>
+            <w:pPr>
+              <w:ind w:firstLine="0"/>
+              <w:jc w:val="center"/>
+              <w:rPr>
+                <w:rFonts w:cs="Arial"/>
+              </w:rPr>
+            </w:pPr>
+            <w:r>
+              <w:rPr>
+                <w:rFonts w:cs="Arial"/>
+              </w:rPr>
+              <w:t>Organização de Escala</w:t>
+            </w:r>
+          </w:p>
+        </w:tc>
+        <w:tc>
+          <w:tcPr>
+            <w:tcW w:w="5704" w:type="dxa"/>
+          </w:tcPr>
+          <w:p>
+            <w:pPr>
+              <w:ind w:firstLine="0"/>
+              <w:rPr>
+                <w:rFonts w:cs="Arial"/>
+              </w:rPr>
+            </w:pPr>
+            <w:r>
+              <w:rPr>
+                <w:rFonts w:cs="Arial"/>
+              </w:rPr>
+              <w:t>Estabelecer um cronograma preliminar de plantões na agenda, assegurando a atualização imediata dos registros caso ocorram alterações no início do turno, para manter a integridade dos dados.</w:t>
+            </w:r>
+          </w:p>
+        </w:tc>
+        <w:tc>
+          <w:tcPr>
+            <w:tcW w:w="1377" w:type="dxa"/>
+          </w:tcPr>
+          <w:p>
+            <w:pPr>
+              <w:ind w:firstLine="0"/>
+              <w:jc w:val="center"/>
+              <w:rPr>
+                <w:rFonts w:cs="Arial"/>
+              </w:rPr>
+            </w:pPr>
+            <w:r>
+              <w:rPr>
+                <w:rFonts w:cs="Arial"/>
+              </w:rPr>
+              <w:t>Sistema</w:t>
+            </w:r>
+          </w:p>
+        </w:tc>
+      </w:tr>
+      <w:tr>
+        <w:tc>
+          <w:tcPr>
+            <w:tcW w:w="839" w:type="dxa"/>
+          </w:tcPr>
+          <w:p>
+            <w:pPr>
+              <w:ind w:firstLine="0"/>
+              <w:jc w:val="center"/>
+              <w:rPr>
+                <w:rFonts w:cs="Arial"/>
+              </w:rPr>
+            </w:pPr>
+            <w:r>
+              <w:rPr>
+                <w:rFonts w:cs="Arial"/>
+              </w:rPr>
+              <w:t>RF09</w:t>
+            </w:r>
+          </w:p>
+        </w:tc>
+        <w:tc>
+          <w:tcPr>
+            <w:tcW w:w="1141" w:type="dxa"/>
+          </w:tcPr>
+          <w:p>
+            <w:pPr>
+              <w:ind w:firstLine="0"/>
+              <w:jc w:val="center"/>
+              <w:rPr>
+                <w:rFonts w:cs="Arial"/>
+              </w:rPr>
+            </w:pPr>
+            <w:r>
+              <w:rPr>
+                <w:rFonts w:cs="Arial"/>
+              </w:rPr>
+              <w:t>Check-out Automático</w:t>
+            </w:r>
+          </w:p>
+        </w:tc>
+        <w:tc>
+          <w:tcPr>
+            <w:tcW w:w="5704" w:type="dxa"/>
+          </w:tcPr>
+          <w:p>
+            <w:pPr>
+              <w:ind w:firstLine="0"/>
+              <w:rPr>
+                <w:rFonts w:cs="Arial"/>
+              </w:rPr>
+            </w:pPr>
+            <w:r>
+              <w:rPr>
+                <w:rFonts w:cs="Arial"/>
+              </w:rPr>
+              <w:t>Aberturas de novos plantões encerram automaticamente o registro anterior em aberto, garantindo a precisão do histórico de escalas.</w:t>
+            </w:r>
+          </w:p>
+        </w:tc>
+        <w:tc>
+          <w:tcPr>
+            <w:tcW w:w="1377" w:type="dxa"/>
+          </w:tcPr>
+          <w:p>
+            <w:pPr>
+              <w:ind w:firstLine="0"/>
+              <w:jc w:val="center"/>
+              <w:rPr>
+                <w:rFonts w:cs="Arial"/>
+              </w:rPr>
+            </w:pPr>
+            <w:r>
+              <w:rPr>
+                <w:rFonts w:cs="Arial"/>
+              </w:rPr>
+              <w:t>Sistema</w:t>
+            </w:r>
+          </w:p>
+        </w:tc>
+      </w:tr>
+      <w:tr>
+        <w:tc>
+          <w:tcPr>
+            <w:tcW w:w="839" w:type="dxa"/>
+          </w:tcPr>
+          <w:p>
+            <w:pPr>
+              <w:ind w:firstLine="0"/>
+              <w:jc w:val="center"/>
+              <w:rPr>
+                <w:rFonts w:cs="Arial"/>
+              </w:rPr>
+            </w:pPr>
+            <w:r>
+              <w:rPr>
+                <w:rFonts w:cs="Arial"/>
+              </w:rPr>
+              <w:t>RF10</w:t>
+            </w:r>
+          </w:p>
+        </w:tc>
+        <w:tc>
+          <w:tcPr>
+            <w:tcW w:w="1141" w:type="dxa"/>
+          </w:tcPr>
+          <w:p>
+            <w:pPr>
+              <w:ind w:firstLine="0"/>
+              <w:jc w:val="center"/>
+              <w:rPr>
+                <w:rFonts w:cs="Arial"/>
+              </w:rPr>
+            </w:pPr>
+            <w:r>
+              <w:rPr>
+                <w:rFonts w:cs="Arial"/>
+              </w:rPr>
+              <w:t>Manter Medicamento</w:t>
+            </w:r>
+          </w:p>
+        </w:tc>
+        <w:tc>
+          <w:tcPr>
+            <w:tcW w:w="5704" w:type="dxa"/>
+          </w:tcPr>
+          <w:p>
+            <w:pPr>
+              <w:ind w:firstLine="0"/>
+              <w:rPr>
+                <w:rFonts w:cs="Arial"/>
+              </w:rPr>
+            </w:pPr>
+            <w:r>
+              <w:rPr>
+                <w:rFonts w:cs="Arial"/>
+              </w:rPr>
+              <w:t>O sistema deve possibilitar o registro da prescrição medicamentosa, permitindo configurar a frequência (período/horários específicos) e o tempo de tratamento, com suporte para medicações de uso contínuo ou temporário (com definição de início e fim).</w:t>
+            </w:r>
+          </w:p>
+        </w:tc>
+        <w:tc>
+          <w:tcPr>
+            <w:tcW w:w="1377" w:type="dxa"/>
+          </w:tcPr>
+          <w:p>
+            <w:pPr>
+              <w:ind w:firstLine="0"/>
+              <w:jc w:val="center"/>
+              <w:rPr>
+                <w:rFonts w:cs="Arial"/>
+              </w:rPr>
+            </w:pPr>
+            <w:r>
+              <w:rPr>
+                <w:rFonts w:cs="Arial"/>
+              </w:rPr>
+              <w:t>Familiar</w:t>
+            </w:r>
+          </w:p>
+        </w:tc>
+      </w:tr>
+      <w:tr>
+        <w:tc>
+          <w:tcPr>
+            <w:tcW w:w="839" w:type="dxa"/>
+          </w:tcPr>
+          <w:p>
+            <w:pPr>
+              <w:ind w:firstLine="0"/>
+              <w:jc w:val="center"/>
+              <w:rPr>
+                <w:rFonts w:cs="Arial"/>
+              </w:rPr>
+            </w:pPr>
+            <w:r>
+              <w:rPr>
+                <w:rFonts w:cs="Arial"/>
+              </w:rPr>
+              <w:t>RF11</w:t>
+            </w:r>
+          </w:p>
+        </w:tc>
+        <w:tc>
+          <w:tcPr>
+            <w:tcW w:w="1141" w:type="dxa"/>
+          </w:tcPr>
+          <w:p>
+            <w:pPr>
+              <w:ind w:firstLine="0"/>
+              <w:jc w:val="center"/>
+              <w:rPr>
+                <w:rFonts w:cs="Arial"/>
+              </w:rPr>
+            </w:pPr>
+            <w:r>
+              <w:rPr>
+                <w:rFonts w:cs="Arial"/>
+              </w:rPr>
+              <w:t>Visualização da rotina do dia</w:t>
+            </w:r>
+          </w:p>
+        </w:tc>
+        <w:tc>
+          <w:tcPr>
+            <w:tcW w:w="5704" w:type="dxa"/>
+          </w:tcPr>
+          <w:p>
+            <w:pPr>
+              <w:ind w:firstLine="0"/>
+              <w:rPr>
+                <w:rFonts w:cs="Arial"/>
+              </w:rPr>
+            </w:pPr>
+            <w:r>
+              <w:rPr>
+                <w:rFonts w:cs="Arial"/>
+              </w:rPr>
+              <w:t>O sistema deve disponibilizar uma visão diária consolidada, organizando cronologicamente todos os medicamentos agendados e consultas médicas previstas para o dia vigente.</w:t>
+            </w:r>
+          </w:p>
+        </w:tc>
+        <w:tc>
+          <w:tcPr>
+            <w:tcW w:w="1377" w:type="dxa"/>
+          </w:tcPr>
+          <w:p>
+            <w:pPr>
+              <w:ind w:firstLine="0"/>
+              <w:jc w:val="center"/>
+              <w:rPr>
+                <w:rFonts w:cs="Arial"/>
+              </w:rPr>
+            </w:pPr>
+            <w:r>
+              <w:rPr>
+                <w:rFonts w:cs="Arial"/>
+              </w:rPr>
+              <w:t>Sistema</w:t>
+            </w:r>
+          </w:p>
+        </w:tc>
+      </w:tr>
+      <w:tr>
+        <w:tc>
+          <w:tcPr>
+            <w:tcW w:w="839" w:type="dxa"/>
+          </w:tcPr>
+          <w:p>
+            <w:pPr>
+              <w:ind w:firstLine="0"/>
+              <w:jc w:val="center"/>
+              <w:rPr>
+                <w:rFonts w:cs="Arial"/>
+              </w:rPr>
+            </w:pPr>
+            <w:r>
+              <w:rPr>
+                <w:rFonts w:cs="Arial"/>
+              </w:rPr>
+              <w:t>RF12</w:t>
+            </w:r>
+          </w:p>
+        </w:tc>
+        <w:tc>
+          <w:tcPr>
+            <w:tcW w:w="1141" w:type="dxa"/>
+          </w:tcPr>
+          <w:p>
+            <w:pPr>
+              <w:ind w:firstLine="0"/>
+              <w:jc w:val="center"/>
+              <w:rPr>
+                <w:rFonts w:cs="Arial"/>
+              </w:rPr>
+            </w:pPr>
+            <w:r>
+              <w:rPr>
+                <w:rFonts w:cs="Arial"/>
+              </w:rPr>
+              <w:t xml:space="preserve">Painel </w:t>
+            </w:r>
+            <w:r>
+              <w:rPr>
+                <w:rFonts w:cs="Arial"/>
+              </w:rPr>
+              <w:t>Administrativo</w:t>
+            </w:r>
+          </w:p>
+        </w:tc>
+        <w:tc>
+          <w:tcPr>
+            <w:tcW w:w="5704" w:type="dxa"/>
+          </w:tcPr>
+          <w:p>
+            <w:pPr>
+              <w:ind w:firstLine="0"/>
+              <w:rPr>
+                <w:rFonts w:cs="Arial"/>
+              </w:rPr>
+            </w:pPr>
+            <w:r>
+              <w:rPr>
+                <w:rFonts w:cs="Arial"/>
+              </w:rPr>
+              <w:t xml:space="preserve">O sistema deve gerar um relatório de horas </w:t>
+            </w:r>
+            <w:r>
+              <w:rPr>
+                <w:rFonts w:cs="Arial"/>
+              </w:rPr>
+              <w:t xml:space="preserve">e dias </w:t>
+            </w:r>
+            <w:r>
+              <w:rPr>
+                <w:rFonts w:cs="Arial"/>
+              </w:rPr>
+              <w:t>trabalhadas</w:t>
+            </w:r>
+            <w:r>
+              <w:rPr>
+                <w:rFonts w:cs="Arial"/>
+              </w:rPr>
+              <w:t xml:space="preserve"> </w:t>
+            </w:r>
+            <w:r>
+              <w:rPr>
+                <w:rFonts w:cs="Arial"/>
+              </w:rPr>
+              <w:t>p</w:t>
+            </w:r>
+            <w:r>
+              <w:rPr>
+                <w:rFonts w:cs="Arial"/>
+              </w:rPr>
+              <w:t>elo</w:t>
+            </w:r>
+            <w:r>
+              <w:rPr>
+                <w:rFonts w:cs="Arial"/>
+              </w:rPr>
+              <w:t xml:space="preserve"> cuidador ao final do mês, </w:t>
+            </w:r>
+            <w:r>
+              <w:rPr>
+                <w:rFonts w:cs="Arial"/>
+              </w:rPr>
+              <w:lastRenderedPageBreak/>
+              <w:t>com base nos registros de check-in e check-out, para fins de pagamento.</w:t>
+            </w:r>
+          </w:p>
+        </w:tc>
+        <w:tc>
+          <w:tcPr>
+            <w:tcW w:w="1377" w:type="dxa"/>
+          </w:tcPr>
+          <w:p>
+            <w:pPr>
+              <w:ind w:firstLine="0"/>
+              <w:jc w:val="center"/>
+              <w:rPr>
+                <w:rFonts w:cs="Arial"/>
+              </w:rPr>
+            </w:pPr>
+            <w:r>
+              <w:rPr>
+                <w:rFonts w:cs="Arial"/>
+              </w:rPr>
+              <w:lastRenderedPageBreak/>
+              <w:t>Sistema</w:t>
+            </w:r>
+          </w:p>
+        </w:tc>
+      </w:tr>
+    </w:tbl>
+    <w:p>
+      <w:pPr>
+        <w:ind w:firstLine="0"/>
+        <w:rPr>
+          <w:rFonts w:cs="Arial"/>
+        </w:rPr>
+      </w:pPr>
+    </w:p>
+    <w:p>
+      <w:pPr>
+        <w:ind w:firstLine="0"/>
+        <w:rPr>
+          <w:rFonts w:cs="Arial"/>
+        </w:rPr>
+      </w:pPr>
+    </w:p>
+    <w:p>
+      <w:pPr>
+        <w:pStyle w:val="Ttulo2"/>
+      </w:pPr>
+      <w:r>
+        <w:t>3.3 Requisitos Não Funcionais</w:t>
+      </w:r>
+    </w:p>
+    <w:p>
+      <w:pPr>
+        <w:ind w:firstLine="0"/>
+        <w:rPr>
+          <w:rFonts w:cs="Arial"/>
+        </w:rPr>
+      </w:pPr>
+    </w:p>
+    <w:tbl>
+      <w:tblPr>
+        <w:tblStyle w:val="Tabelacomgrade"/>
+        <w:tblW w:w="0" w:type="auto"/>
+        <w:tblLook w:val="04A0" w:firstRow="1" w:lastRow="0" w:firstColumn="1" w:lastColumn="0" w:noHBand="0" w:noVBand="1"/>
+      </w:tblPr>
+      <w:tblGrid>
+        <w:gridCol w:w="1413"/>
+        <w:gridCol w:w="7648"/>
+      </w:tblGrid>
+      <w:tr>
+        <w:tc>
+          <w:tcPr>
+            <w:tcW w:w="1413" w:type="dxa"/>
+          </w:tcPr>
+          <w:p>
+            <w:pPr>
+              <w:ind w:firstLine="0"/>
+              <w:jc w:val="center"/>
+              <w:rPr>
+                <w:rFonts w:cs="Arial"/>
+              </w:rPr>
+            </w:pPr>
+            <w:r>
+              <w:rPr>
+                <w:rFonts w:cs="Arial"/>
+                <w:b/>
+                <w:bCs/>
+              </w:rPr>
+              <w:t>Nº</w:t>
+            </w:r>
+          </w:p>
+        </w:tc>
+        <w:tc>
+          <w:tcPr>
+            <w:tcW w:w="7648" w:type="dxa"/>
+          </w:tcPr>
+          <w:p>
+            <w:pPr>
+              <w:ind w:firstLine="0"/>
+              <w:jc w:val="center"/>
+              <w:rPr>
+                <w:rFonts w:cs="Arial"/>
+              </w:rPr>
+            </w:pPr>
+            <w:r>
+              <w:rPr>
+                <w:rFonts w:cs="Arial"/>
+                <w:b/>
+                <w:bCs/>
+              </w:rPr>
+              <w:t>Descrição</w:t>
+            </w:r>
+          </w:p>
+        </w:tc>
+      </w:tr>
+      <w:tr>
+        <w:tc>
+          <w:tcPr>
+            <w:tcW w:w="1413" w:type="dxa"/>
+          </w:tcPr>
+          <w:p>
+            <w:pPr>
+              <w:ind w:firstLine="0"/>
+              <w:rPr>
+                <w:rFonts w:cs="Arial"/>
+              </w:rPr>
+            </w:pPr>
+            <w:r>
+              <w:rPr>
+                <w:rFonts w:cs="Arial"/>
+              </w:rPr>
+              <w:t>RNF01</w:t>
+            </w:r>
+          </w:p>
+        </w:tc>
+        <w:tc>
+          <w:tcPr>
+            <w:tcW w:w="7648" w:type="dxa"/>
+          </w:tcPr>
+          <w:p>
+            <w:pPr>
+              <w:ind w:firstLine="0"/>
+              <w:rPr>
+                <w:rFonts w:cs="Arial"/>
+              </w:rPr>
+            </w:pPr>
+            <w:r>
+              <w:rPr>
+                <w:rFonts w:cs="Arial"/>
+              </w:rPr>
+              <w:t>A interface do sistema deve ser responsiva, adaptando-se perfeitamente a dispositivos móveis (Android/iOS) e navegadores desktop.</w:t>
+            </w:r>
+          </w:p>
+        </w:tc>
+      </w:tr>
+      <w:tr>
+        <w:tc>
+          <w:tcPr>
+            <w:tcW w:w="1413" w:type="dxa"/>
+          </w:tcPr>
+          <w:p>
+            <w:pPr>
+              <w:ind w:firstLine="0"/>
+              <w:rPr>
+                <w:rFonts w:cs="Arial"/>
+              </w:rPr>
+            </w:pPr>
+            <w:r>
+              <w:rPr>
+                <w:rFonts w:cs="Arial"/>
+              </w:rPr>
+              <w:t>RNF0</w:t>
+            </w:r>
+            <w:r>
+              <w:rPr>
+                <w:rFonts w:cs="Arial"/>
+              </w:rPr>
+              <w:t>2</w:t>
+            </w:r>
+          </w:p>
+        </w:tc>
+        <w:tc>
+          <w:tcPr>
+            <w:tcW w:w="7648" w:type="dxa"/>
+          </w:tcPr>
+          <w:p>
+            <w:pPr>
+              <w:ind w:firstLine="0"/>
+              <w:rPr>
+                <w:rFonts w:cs="Arial"/>
+              </w:rPr>
+            </w:pPr>
+            <w:r>
+              <w:rPr>
+                <w:rFonts w:cs="Arial"/>
+              </w:rPr>
+              <w:t>O acesso ao sistema deve ser protegido por autenticação (e-mail e senha), garantindo que cuidadores só visualizem dados dos pacientes aos quais estão vinculados.</w:t>
+            </w:r>
+          </w:p>
+        </w:tc>
+      </w:tr>
+      <w:tr>
+        <w:tc>
+          <w:tcPr>
+            <w:tcW w:w="1413" w:type="dxa"/>
+          </w:tcPr>
+          <w:p>
+            <w:pPr>
+              <w:ind w:firstLine="0"/>
+              <w:rPr>
+                <w:rFonts w:cs="Arial"/>
+              </w:rPr>
+            </w:pPr>
+            <w:r>
+              <w:rPr>
+                <w:rFonts w:cs="Arial"/>
+              </w:rPr>
+              <w:t>RNF0</w:t>
+            </w:r>
+            <w:r>
+              <w:rPr>
+                <w:rFonts w:cs="Arial"/>
+              </w:rPr>
+              <w:t>3</w:t>
+            </w:r>
+          </w:p>
+        </w:tc>
+        <w:tc>
+          <w:tcPr>
+            <w:tcW w:w="7648" w:type="dxa"/>
+          </w:tcPr>
+          <w:p>
+            <w:pPr>
+              <w:ind w:firstLine="0"/>
+              <w:rPr>
+                <w:rFonts w:cs="Arial"/>
+              </w:rPr>
+            </w:pPr>
+            <w:r>
+              <w:rPr>
+                <w:rFonts w:cs="Arial"/>
+              </w:rPr>
+              <w:t>O sistema deve estar em conformidade com a Lei Geral de Proteção de Dados (LGPD), permitindo que o usuário solicite a exclusão de seus dados pessoais.</w:t>
+            </w:r>
+          </w:p>
+        </w:tc>
+      </w:tr>
+    </w:tbl>
+    <w:p>
+      <w:pPr>
+        <w:ind w:firstLine="0"/>
+        <w:rPr>
+          <w:rFonts w:cs="Arial"/>
+        </w:rPr>
+      </w:pPr>
+    </w:p>
+    <w:p>
+      <w:pPr>
+        <w:ind w:firstLine="0"/>
+        <w:rPr>
+          <w:rFonts w:cs="Arial"/>
+        </w:rPr>
+      </w:pPr>
+    </w:p>
+    <w:p>
+      <w:pPr>
+        <w:ind w:firstLine="0"/>
+        <w:rPr>
+          <w:rFonts w:cs="Arial"/>
+        </w:rPr>
+      </w:pPr>
       <w:r>
         <w:rPr>
           <w:rFonts w:cs="Arial"/>
@@ -2365,34 +4240,6 @@
         <w:rPr>
           <w:rFonts w:cs="Arial"/>
         </w:rPr>
-        <w:t>Requisitos Funcionais</w:t>
-      </w:r>
-    </w:p>
-    <w:p>
-      <w:pPr>
-        <w:ind w:firstLine="0"/>
-        <w:rPr>
-          <w:rFonts w:cs="Arial"/>
-        </w:rPr>
-      </w:pPr>
-      <w:r>
-        <w:rPr>
-          <w:rFonts w:cs="Arial"/>
-        </w:rPr>
-        <w:t>Requisitos Não Funcionais</w:t>
-      </w:r>
-    </w:p>
-    <w:p>
-      <w:pPr>
-        <w:ind w:firstLine="0"/>
-        <w:rPr>
-          <w:rFonts w:cs="Arial"/>
-        </w:rPr>
-      </w:pPr>
-      <w:r>
-        <w:rPr>
-          <w:rFonts w:cs="Arial"/>
-        </w:rPr>
         <w:t>D</w:t>
       </w:r>
       <w:r>
@@ -2413,7 +4260,6 @@
         <w:rPr>
           <w:rFonts w:cs="Arial"/>
         </w:rPr>
-        <w:lastRenderedPageBreak/>
         <w:t>DCU</w:t>
       </w:r>
     </w:p>
@@ -2460,14 +4306,12 @@
           <w:rFonts w:cs="Arial"/>
         </w:rPr>
       </w:pPr>
-      <w:proofErr w:type="spellStart"/>
       <w:r>
         <w:rPr>
           <w:rFonts w:cs="Arial"/>
         </w:rPr>
         <w:t>Wireframe</w:t>
       </w:r>
-      <w:proofErr w:type="spellEnd"/>
     </w:p>
     <w:p>
       <w:pPr>
@@ -2642,23 +4486,7 @@
           <w:rFonts w:cs="Arial"/>
           <w:color w:val="FF0000"/>
         </w:rPr>
-        <w:t xml:space="preserve">O texto do trabalho deve ser escrito em estilo Normal. Usar espaçamento 1,5 entre as linhas e 0 </w:t>
-      </w:r>
-      <w:proofErr w:type="spellStart"/>
-      <w:r>
-        <w:rPr>
-          <w:rFonts w:cs="Arial"/>
-          <w:color w:val="FF0000"/>
-        </w:rPr>
-        <w:t>pts</w:t>
-      </w:r>
-      <w:proofErr w:type="spellEnd"/>
-      <w:r>
-        <w:rPr>
-          <w:rFonts w:cs="Arial"/>
-          <w:color w:val="FF0000"/>
-        </w:rPr>
-        <w:t xml:space="preserve"> entre os parágrafos.</w:t>
+        <w:t>O texto do trabalho deve ser escrito em estilo Normal. Usar espaçamento 1,5 entre as linhas e 0 pts entre os parágrafos.</w:t>
       </w:r>
     </w:p>
     <w:p>
@@ -3008,7 +4836,7 @@
           <w:noProof/>
         </w:rPr>
         <w:pict w14:anchorId="5A1BC969">
-          <v:rect id="_x0000_s1025" alt="" style="position:absolute;left:0;text-align:left;margin-left:0;margin-top:0;width:595.3pt;height:841.9pt;z-index:251659264;mso-wrap-edited:f;mso-width-percent:1000;mso-height-percent:1000;mso-position-horizontal-relative:page;mso-position-vertical-relative:page;mso-width-percent:1000;mso-height-percent:1000;mso-width-relative:page;mso-height-relative:page" o:bwmode="white" filled="f" stroked="f" strokeweight="0">
+          <v:rect id="_x0000_s1025" alt="" style="position:absolute;left:0;text-align:left;margin-left:0;margin-top:0;width:595.3pt;height:841.9pt;z-index:251658240;mso-wrap-edited:f;mso-width-percent:1000;mso-height-percent:1000;mso-position-horizontal-relative:page;mso-position-vertical-relative:page;mso-width-percent:1000;mso-height-percent:1000;mso-width-relative:page;mso-height-relative:page" o:bwmode="white" filled="f" stroked="f" strokeweight="0">
             <w10:wrap anchorx="margin" anchory="margin"/>
           </v:rect>
         </w:pict>
@@ -3835,7 +5663,6 @@
   <w:style w:type="character" w:default="1" w:styleId="Fontepargpadro">
     <w:name w:val="Default Paragraph Font"/>
     <w:uiPriority w:val="1"/>
-    <w:semiHidden/>
     <w:unhideWhenUsed/>
   </w:style>
   <w:style w:type="table" w:default="1" w:styleId="Tabelanormal">

</xml_diff>